<commit_message>
Sửa lỗi câu hỏi cắt ảnh từ PDF hiện trống trơn ở "Tự kiểm tra" và khi in đề ra giấy; file mẫu PDF có sẵn 20 câu ví dụ thật
- "Tự kiểm tra" (renderSelfTestQuestion) và "Xuất đề in giấy" (renderQuestionBlockHtml) trước đây chỉ
  hiện thẳng item.q/item.options — vốn chỉ là nhãn/chữ cái giữ chỗ cho câu nạp từ PDF (nội dung thật
  nằm trong ảnh) — nên hiện trống trơn không làm bài được. Sửa dùng getQuizVisual() để vẽ đúng ảnh,
  giống cách "Ôn tập" và làm bài kiểm tra online đã làm đúng từ trước.
- File mẫu Word cho "Nạp đề thi PDF" trước đây chỉ có 2 câu ví dụ giữ chỗ chung chung — thay bằng 20
  câu hoá học thật để giáo viên xem đúng cấu trúc cần soạn.

Co-Authored-By: Claude Sonnet 5 <noreply@anthropic.com>
</commit_message>
<xml_diff>
--- a/templates/mau-de-trac-nghiem-pdf.docx
+++ b/templates/mau-de-trac-nghiem-pdf.docx
@@ -127,53 +127,521 @@
     </w:p>
     <w:p>
       <w:r>
-        <w:t>Câu 1. Đây là câu hỏi mẫu — công thức hoá học ví dụ: dung dịch H2SO4 có nồng độ 0,1M?</w:t>
-      </w:r>
-    </w:p>
-    <w:p>
-      <w:r>
-        <w:t>A. Phương án trả lời A</w:t>
-      </w:r>
-    </w:p>
-    <w:p>
-      <w:r>
-        <w:t>B. Phương án trả lời B</w:t>
-      </w:r>
-    </w:p>
-    <w:p>
-      <w:r>
-        <w:t>C. Phương án trả lời C</w:t>
-      </w:r>
-    </w:p>
-    <w:p>
-      <w:r>
-        <w:t>D. Phương án trả lời D</w:t>
-      </w:r>
-    </w:p>
-    <w:p/>
-    <w:p>
-      <w:r>
-        <w:t>Câu 2. Câu hỏi mẫu thứ hai, có thể dài nhiều dòng cũng không sao, miễn KHÔNG xuống dòng trống ở giữa câu hỏi này?</w:t>
-      </w:r>
-    </w:p>
-    <w:p>
-      <w:r>
-        <w:t>A. Phương án trả lời A</w:t>
-      </w:r>
-    </w:p>
-    <w:p>
-      <w:r>
-        <w:t>B. Phương án trả lời B</w:t>
-      </w:r>
-    </w:p>
-    <w:p>
-      <w:r>
-        <w:t>C. Phương án trả lời C</w:t>
-      </w:r>
-    </w:p>
-    <w:p>
-      <w:r>
-        <w:t>D. Phương án trả lời D</w:t>
+        <w:t xml:space="preserve">Câu 1. Nguyên tử trung hoà về điện vì:</w:t>
+      </w:r>
+    </w:p>
+    <w:p>
+      <w:r>
+        <w:t xml:space="preserve">A. Số proton = số neutron</w:t>
+      </w:r>
+    </w:p>
+    <w:p>
+      <w:r>
+        <w:t xml:space="preserve">B. Số electron = số neutron</w:t>
+      </w:r>
+    </w:p>
+    <w:p>
+      <w:r>
+        <w:t xml:space="preserve">C. Số electron = số proton</w:t>
+      </w:r>
+    </w:p>
+    <w:p>
+      <w:r>
+        <w:t xml:space="preserve">D. Nguyên tử không có electron</w:t>
+      </w:r>
+    </w:p>
+    <w:p/>
+    <w:p>
+      <w:r>
+        <w:t xml:space="preserve">Câu 2. Kim loại nào ở thể lỏng tại nhiệt độ thường?</w:t>
+      </w:r>
+    </w:p>
+    <w:p>
+      <w:r>
+        <w:t xml:space="preserve">A. Sắt</w:t>
+      </w:r>
+    </w:p>
+    <w:p>
+      <w:r>
+        <w:t xml:space="preserve">B. Thuỷ ngân</w:t>
+      </w:r>
+    </w:p>
+    <w:p>
+      <w:r>
+        <w:t xml:space="preserve">C. Nhôm</w:t>
+      </w:r>
+    </w:p>
+    <w:p>
+      <w:r>
+        <w:t xml:space="preserve">D. Kẽm</w:t>
+      </w:r>
+    </w:p>
+    <w:p/>
+    <w:p>
+      <w:r>
+        <w:t xml:space="preserve">Câu 3. Công thức hoá học của khí oxi là:</w:t>
+      </w:r>
+    </w:p>
+    <w:p>
+      <w:r>
+        <w:t xml:space="preserve">A. O</w:t>
+      </w:r>
+    </w:p>
+    <w:p>
+      <w:r>
+        <w:t xml:space="preserve">B. O2</w:t>
+      </w:r>
+    </w:p>
+    <w:p>
+      <w:r>
+        <w:t xml:space="preserve">C. O3</w:t>
+      </w:r>
+    </w:p>
+    <w:p>
+      <w:r>
+        <w:t xml:space="preserve">D. 2O</w:t>
+      </w:r>
+    </w:p>
+    <w:p/>
+    <w:p>
+      <w:r>
+        <w:t xml:space="preserve">Câu 4. Trong bảng tuần hoàn, các nguyên tố được sắp xếp theo chiều tăng dần của:</w:t>
+      </w:r>
+    </w:p>
+    <w:p>
+      <w:r>
+        <w:t xml:space="preserve">A. Số khối</w:t>
+      </w:r>
+    </w:p>
+    <w:p>
+      <w:r>
+        <w:t xml:space="preserve">B. Số neutron</w:t>
+      </w:r>
+    </w:p>
+    <w:p>
+      <w:r>
+        <w:t xml:space="preserve">C. Điện tích hạt nhân</w:t>
+      </w:r>
+    </w:p>
+    <w:p>
+      <w:r>
+        <w:t xml:space="preserve">D. Khối lượng nguyên tử</w:t>
+      </w:r>
+    </w:p>
+    <w:p/>
+    <w:p>
+      <w:r>
+        <w:t xml:space="preserve">Câu 5. Liên kết hoá học trong phân tử NaCl là:</w:t>
+      </w:r>
+    </w:p>
+    <w:p>
+      <w:r>
+        <w:t xml:space="preserve">A. Liên kết cộng hoá trị</w:t>
+      </w:r>
+    </w:p>
+    <w:p>
+      <w:r>
+        <w:t xml:space="preserve">B. Liên kết ion</w:t>
+      </w:r>
+    </w:p>
+    <w:p>
+      <w:r>
+        <w:t xml:space="preserve">C. Liên kết kim loại</w:t>
+      </w:r>
+    </w:p>
+    <w:p>
+      <w:r>
+        <w:t xml:space="preserve">D. Liên kết hydrogen</w:t>
+      </w:r>
+    </w:p>
+    <w:p/>
+    <w:p>
+      <w:r>
+        <w:t xml:space="preserve">Câu 6. Chất nào sau đây là oxit axit?</w:t>
+      </w:r>
+    </w:p>
+    <w:p>
+      <w:r>
+        <w:t xml:space="preserve">A. CaO</w:t>
+      </w:r>
+    </w:p>
+    <w:p>
+      <w:r>
+        <w:t xml:space="preserve">B. Na2O</w:t>
+      </w:r>
+    </w:p>
+    <w:p>
+      <w:r>
+        <w:t xml:space="preserve">C. CO2</w:t>
+      </w:r>
+    </w:p>
+    <w:p>
+      <w:r>
+        <w:t xml:space="preserve">D. Fe2O3</w:t>
+      </w:r>
+    </w:p>
+    <w:p/>
+    <w:p>
+      <w:r>
+        <w:t xml:space="preserve">Câu 7. Dung dịch nào làm quỳ tím chuyển sang màu đỏ?</w:t>
+      </w:r>
+    </w:p>
+    <w:p>
+      <w:r>
+        <w:t xml:space="preserve">A. NaOH</w:t>
+      </w:r>
+    </w:p>
+    <w:p>
+      <w:r>
+        <w:t xml:space="preserve">B. HCl</w:t>
+      </w:r>
+    </w:p>
+    <w:p>
+      <w:r>
+        <w:t xml:space="preserve">C. NaCl</w:t>
+      </w:r>
+    </w:p>
+    <w:p>
+      <w:r>
+        <w:t xml:space="preserve">D. Ca(OH)2</w:t>
+      </w:r>
+    </w:p>
+    <w:p/>
+    <w:p>
+      <w:r>
+        <w:t xml:space="preserve">Câu 8. Ở điều kiện tiêu chuẩn, 22,4 lít khí CO2 tương ứng với số mol là:</w:t>
+      </w:r>
+    </w:p>
+    <w:p>
+      <w:r>
+        <w:t xml:space="preserve">A. 0,5 mol</w:t>
+      </w:r>
+    </w:p>
+    <w:p>
+      <w:r>
+        <w:t xml:space="preserve">B. 1 mol</w:t>
+      </w:r>
+    </w:p>
+    <w:p>
+      <w:r>
+        <w:t xml:space="preserve">C. 2 mol</w:t>
+      </w:r>
+    </w:p>
+    <w:p>
+      <w:r>
+        <w:t xml:space="preserve">D. 1,5 mol</w:t>
+      </w:r>
+    </w:p>
+    <w:p/>
+    <w:p>
+      <w:r>
+        <w:t xml:space="preserve">Câu 9. Kim loại nào tác dụng được với nước ở nhiệt độ thường?</w:t>
+      </w:r>
+    </w:p>
+    <w:p>
+      <w:r>
+        <w:t xml:space="preserve">A. Fe</w:t>
+      </w:r>
+    </w:p>
+    <w:p>
+      <w:r>
+        <w:t xml:space="preserve">B. Cu</w:t>
+      </w:r>
+    </w:p>
+    <w:p>
+      <w:r>
+        <w:t xml:space="preserve">C. Na</w:t>
+      </w:r>
+    </w:p>
+    <w:p>
+      <w:r>
+        <w:t xml:space="preserve">D. Ag</w:t>
+      </w:r>
+    </w:p>
+    <w:p/>
+    <w:p>
+      <w:r>
+        <w:t xml:space="preserve">Câu 10. Công thức phân tử của methane (khí thiên nhiên) là:</w:t>
+      </w:r>
+    </w:p>
+    <w:p>
+      <w:r>
+        <w:t xml:space="preserve">A. CH4</w:t>
+      </w:r>
+    </w:p>
+    <w:p>
+      <w:r>
+        <w:t xml:space="preserve">B. C2H6</w:t>
+      </w:r>
+    </w:p>
+    <w:p>
+      <w:r>
+        <w:t xml:space="preserve">C. C2H4</w:t>
+      </w:r>
+    </w:p>
+    <w:p>
+      <w:r>
+        <w:t xml:space="preserve">D. C2H2</w:t>
+      </w:r>
+    </w:p>
+    <w:p/>
+    <w:p>
+      <w:r>
+        <w:t xml:space="preserve">Câu 11. Dãy chất nào sau đây đều là muối?</w:t>
+      </w:r>
+    </w:p>
+    <w:p>
+      <w:r>
+        <w:t xml:space="preserve">A. NaCl, CaCO3, KNO3</w:t>
+      </w:r>
+    </w:p>
+    <w:p>
+      <w:r>
+        <w:t xml:space="preserve">B. NaOH, HCl, H2SO4</w:t>
+      </w:r>
+    </w:p>
+    <w:p>
+      <w:r>
+        <w:t xml:space="preserve">C. CO2, SO2, NO2</w:t>
+      </w:r>
+    </w:p>
+    <w:p>
+      <w:r>
+        <w:t xml:space="preserve">D. Fe, Cu, Zn</w:t>
+      </w:r>
+    </w:p>
+    <w:p/>
+    <w:p>
+      <w:r>
+        <w:t xml:space="preserve">Câu 12. Hiện tượng nào sau đây là hiện tượng hoá học?</w:t>
+      </w:r>
+    </w:p>
+    <w:p>
+      <w:r>
+        <w:t xml:space="preserve">A. Nước đá tan chảy</w:t>
+      </w:r>
+    </w:p>
+    <w:p>
+      <w:r>
+        <w:t xml:space="preserve">B. Đinh sắt bị gỉ trong không khí ẩm</w:t>
+      </w:r>
+    </w:p>
+    <w:p>
+      <w:r>
+        <w:t xml:space="preserve">C. Hoà tan đường vào nước</w:t>
+      </w:r>
+    </w:p>
+    <w:p>
+      <w:r>
+        <w:t xml:space="preserve">D. Cồn bay hơi</w:t>
+      </w:r>
+    </w:p>
+    <w:p/>
+    <w:p>
+      <w:r>
+        <w:t xml:space="preserve">Câu 13. Chất xúc tác có vai trò gì trong phản ứng hoá học?</w:t>
+      </w:r>
+    </w:p>
+    <w:p>
+      <w:r>
+        <w:t xml:space="preserve">A. Làm tăng khối lượng sản phẩm</w:t>
+      </w:r>
+    </w:p>
+    <w:p>
+      <w:r>
+        <w:t xml:space="preserve">B. Làm thay đổi bản chất phản ứng</w:t>
+      </w:r>
+    </w:p>
+    <w:p>
+      <w:r>
+        <w:t xml:space="preserve">C. Làm tăng tốc độ phản ứng nhưng không bị biến đổi</w:t>
+      </w:r>
+    </w:p>
+    <w:p>
+      <w:r>
+        <w:t xml:space="preserve">D. Làm giảm tốc độ phản ứng</w:t>
+      </w:r>
+    </w:p>
+    <w:p/>
+    <w:p>
+      <w:r>
+        <w:t xml:space="preserve">Câu 14. Trong công nghiệp, ammonia (NH3) được điều chế chủ yếu bằng phương pháp nào?</w:t>
+      </w:r>
+    </w:p>
+    <w:p>
+      <w:r>
+        <w:t xml:space="preserve">A. Điện phân</w:t>
+      </w:r>
+    </w:p>
+    <w:p>
+      <w:r>
+        <w:t xml:space="preserve">B. Tổng hợp trực tiếp từ N2 và H2</w:t>
+      </w:r>
+    </w:p>
+    <w:p>
+      <w:r>
+        <w:t xml:space="preserve">C. Nhiệt phân muối amoni</w:t>
+      </w:r>
+    </w:p>
+    <w:p>
+      <w:r>
+        <w:t xml:space="preserve">D. Cho kim loại tác dụng với axit</w:t>
+      </w:r>
+    </w:p>
+    <w:p/>
+    <w:p>
+      <w:r>
+        <w:t xml:space="preserve">Câu 15. Số hiệu nguyên tử (Z) của một nguyên tố cho biết:</w:t>
+      </w:r>
+    </w:p>
+    <w:p>
+      <w:r>
+        <w:t xml:space="preserve">A. Số neutron trong hạt nhân</w:t>
+      </w:r>
+    </w:p>
+    <w:p>
+      <w:r>
+        <w:t xml:space="preserve">B. Số proton trong hạt nhân</w:t>
+      </w:r>
+    </w:p>
+    <w:p>
+      <w:r>
+        <w:t xml:space="preserve">C. Số khối của nguyên tử</w:t>
+      </w:r>
+    </w:p>
+    <w:p>
+      <w:r>
+        <w:t xml:space="preserve">D. Số lớp electron</w:t>
+      </w:r>
+    </w:p>
+    <w:p/>
+    <w:p>
+      <w:r>
+        <w:t xml:space="preserve">Câu 16. Dãy kim loại nào sau đây được sắp xếp theo chiều hoạt động hoá học giảm dần?</w:t>
+      </w:r>
+    </w:p>
+    <w:p>
+      <w:r>
+        <w:t xml:space="preserve">A. K, Na, Fe, Cu</w:t>
+      </w:r>
+    </w:p>
+    <w:p>
+      <w:r>
+        <w:t xml:space="preserve">B. Cu, Fe, Na, K</w:t>
+      </w:r>
+    </w:p>
+    <w:p>
+      <w:r>
+        <w:t xml:space="preserve">C. Fe, Cu, K, Na</w:t>
+      </w:r>
+    </w:p>
+    <w:p>
+      <w:r>
+        <w:t xml:space="preserve">D. Na, K, Cu, Fe</w:t>
+      </w:r>
+    </w:p>
+    <w:p/>
+    <w:p>
+      <w:r>
+        <w:t xml:space="preserve">Câu 17. Phản ứng giữa axit và bazơ tạo ra muối và nước được gọi là phản ứng gì?</w:t>
+      </w:r>
+    </w:p>
+    <w:p>
+      <w:r>
+        <w:t xml:space="preserve">A. Phản ứng thế</w:t>
+      </w:r>
+    </w:p>
+    <w:p>
+      <w:r>
+        <w:t xml:space="preserve">B. Phản ứng trung hoà</w:t>
+      </w:r>
+    </w:p>
+    <w:p>
+      <w:r>
+        <w:t xml:space="preserve">C. Phản ứng phân huỷ</w:t>
+      </w:r>
+    </w:p>
+    <w:p>
+      <w:r>
+        <w:t xml:space="preserve">D. Phản ứng hoá hợp</w:t>
+      </w:r>
+    </w:p>
+    <w:p/>
+    <w:p>
+      <w:r>
+        <w:t xml:space="preserve">Câu 18. Chất nào sau đây được dùng để khử chua đất trồng trọt?</w:t>
+      </w:r>
+    </w:p>
+    <w:p>
+      <w:r>
+        <w:t xml:space="preserve">A. NaCl</w:t>
+      </w:r>
+    </w:p>
+    <w:p>
+      <w:r>
+        <w:t xml:space="preserve">B. CaO</w:t>
+      </w:r>
+    </w:p>
+    <w:p>
+      <w:r>
+        <w:t xml:space="preserve">C. CuSO4</w:t>
+      </w:r>
+    </w:p>
+    <w:p>
+      <w:r>
+        <w:t xml:space="preserve">D. AgNO3</w:t>
+      </w:r>
+    </w:p>
+    <w:p/>
+    <w:p>
+      <w:r>
+        <w:t xml:space="preserve">Câu 19. Trong phân tử ethanol (C2H5OH), số nguyên tử hydro là:</w:t>
+      </w:r>
+    </w:p>
+    <w:p>
+      <w:r>
+        <w:t xml:space="preserve">A. 4</w:t>
+      </w:r>
+    </w:p>
+    <w:p>
+      <w:r>
+        <w:t xml:space="preserve">B. 5</w:t>
+      </w:r>
+    </w:p>
+    <w:p>
+      <w:r>
+        <w:t xml:space="preserve">C. 6</w:t>
+      </w:r>
+    </w:p>
+    <w:p>
+      <w:r>
+        <w:t xml:space="preserve">D. 8</w:t>
+      </w:r>
+    </w:p>
+    <w:p/>
+    <w:p>
+      <w:r>
+        <w:t xml:space="preserve">Câu 20. Kim loại nào sau đây dẫn điện tốt nhất?</w:t>
+      </w:r>
+    </w:p>
+    <w:p>
+      <w:r>
+        <w:t xml:space="preserve">A. Sắt</w:t>
+      </w:r>
+    </w:p>
+    <w:p>
+      <w:r>
+        <w:t xml:space="preserve">B. Nhôm</w:t>
+      </w:r>
+    </w:p>
+    <w:p>
+      <w:r>
+        <w:t xml:space="preserve">C. Bạc</w:t>
+      </w:r>
+    </w:p>
+    <w:p>
+      <w:r>
+        <w:t xml:space="preserve">D. Chì</w:t>
       </w:r>
     </w:p>
     <w:p/>
@@ -192,7 +660,7 @@
     </w:p>
     <w:p>
       <w:r>
-        <w:t>Câu 1. Trình bày cách pha chế 100 mL dung dịch NaOH 0,1M từ NaOH rắn.</w:t>
+        <w:t xml:space="preserve">Câu 1. Trình bày cách pha chế 100 mL dung dịch NaOH 0,1M từ NaOH rắn.</w:t>
       </w:r>
     </w:p>
     <w:p/>

</xml_diff>